<commit_message>
Working on Exam Problem
</commit_message>
<xml_diff>
--- a/Project 1/Technical Report.docx
+++ b/Project 1/Technical Report.docx
@@ -157,14 +157,34 @@
         </w:rPr>
         <w:t>Data Source: Bassam, A., et al. (2010). Computers &amp; Geosciences, 36(9), 1191–1199.</w:t>
       </w:r>
-    </w:p>
-    <w:p>
-      <w:pPr>
-        <w:spacing w:line="240" w:lineRule="auto"/>
-        <w:rPr>
-          <w:rFonts w:ascii="Times New Roman" w:hAnsi="Times New Roman" w:cs="Times New Roman"/>
-        </w:rPr>
-      </w:pPr>
+      <w:r>
+        <w:rPr>
+          <w:rFonts w:ascii="Times New Roman" w:hAnsi="Times New Roman" w:cs="Times New Roman"/>
+          <w:sz w:val="22"/>
+          <w:szCs w:val="22"/>
+        </w:rPr>
+        <w:br/>
+        <w:t xml:space="preserve">Code: </w:t>
+      </w:r>
+      <w:hyperlink r:id="rId4" w:history="1">
+        <w:r>
+          <w:rPr>
+            <w:rStyle w:val="Hyperlink"/>
+            <w:rFonts w:ascii="Times New Roman" w:hAnsi="Times New Roman" w:cs="Times New Roman"/>
+            <w:sz w:val="22"/>
+            <w:szCs w:val="22"/>
+          </w:rPr>
+          <w:t>https://github.com/TheDataHokage/Scientific_Machine_Learning/blob/main/Project%201/geopinn.ipynb</w:t>
+        </w:r>
+      </w:hyperlink>
+      <w:r>
+        <w:rPr>
+          <w:rFonts w:ascii="Times New Roman" w:hAnsi="Times New Roman" w:cs="Times New Roman"/>
+          <w:sz w:val="22"/>
+          <w:szCs w:val="22"/>
+        </w:rPr>
+        <w:t xml:space="preserve"> </w:t>
+      </w:r>
     </w:p>
     <w:p>
       <w:pPr>
@@ -2582,7 +2602,7 @@
                     <pic:cNvPicPr/>
                   </pic:nvPicPr>
                   <pic:blipFill>
-                    <a:blip r:embed="rId4"/>
+                    <a:blip r:embed="rId5"/>
                     <a:stretch>
                       <a:fillRect/>
                     </a:stretch>
@@ -2689,6 +2709,7 @@
           <w:rFonts w:ascii="Times New Roman" w:hAnsi="Times New Roman" w:cs="Times New Roman"/>
           <w:b/>
           <w:bCs/>
+          <w:noProof/>
           <w:sz w:val="32"/>
           <w:szCs w:val="32"/>
         </w:rPr>
@@ -2708,7 +2729,7 @@
                     <pic:cNvPicPr/>
                   </pic:nvPicPr>
                   <pic:blipFill>
-                    <a:blip r:embed="rId5"/>
+                    <a:blip r:embed="rId6"/>
                     <a:stretch>
                       <a:fillRect/>
                     </a:stretch>
@@ -2799,6 +2820,7 @@
           <w:rFonts w:ascii="Times New Roman" w:hAnsi="Times New Roman" w:cs="Times New Roman"/>
           <w:b/>
           <w:bCs/>
+          <w:noProof/>
           <w:sz w:val="32"/>
           <w:szCs w:val="32"/>
         </w:rPr>
@@ -2818,7 +2840,7 @@
                     <pic:cNvPicPr/>
                   </pic:nvPicPr>
                   <pic:blipFill>
-                    <a:blip r:embed="rId6"/>
+                    <a:blip r:embed="rId7"/>
                     <a:stretch>
                       <a:fillRect/>
                     </a:stretch>
@@ -2886,6 +2908,7 @@
       <w:r>
         <w:rPr>
           <w:rFonts w:ascii="Times New Roman" w:hAnsi="Times New Roman" w:cs="Times New Roman"/>
+          <w:noProof/>
           <w:sz w:val="22"/>
           <w:szCs w:val="22"/>
         </w:rPr>
@@ -2906,7 +2929,7 @@
                     <pic:cNvPicPr/>
                   </pic:nvPicPr>
                   <pic:blipFill>
-                    <a:blip r:embed="rId7"/>
+                    <a:blip r:embed="rId8"/>
                     <a:stretch>
                       <a:fillRect/>
                     </a:stretch>
@@ -3263,7 +3286,23 @@
           <w:sz w:val="22"/>
           <w:szCs w:val="22"/>
         </w:rPr>
-        <w:t xml:space="preserve"> Future steps are to contact the author to learn how their physics model was implemented to achieve a better match than mine.</w:t>
+        <w:t xml:space="preserve"> Future steps </w:t>
+      </w:r>
+      <w:r>
+        <w:rPr>
+          <w:rFonts w:ascii="Times New Roman" w:hAnsi="Times New Roman" w:cs="Times New Roman"/>
+          <w:sz w:val="22"/>
+          <w:szCs w:val="22"/>
+        </w:rPr>
+        <w:t>include contacting</w:t>
+      </w:r>
+      <w:r>
+        <w:rPr>
+          <w:rFonts w:ascii="Times New Roman" w:hAnsi="Times New Roman" w:cs="Times New Roman"/>
+          <w:sz w:val="22"/>
+          <w:szCs w:val="22"/>
+        </w:rPr>
+        <w:t xml:space="preserve"> the author to learn how their physics model was implemented to achieve a better match than mine.</w:t>
       </w:r>
     </w:p>
     <w:sectPr>
@@ -4222,6 +4261,29 @@
       <w:color w:val="666666"/>
     </w:rPr>
   </w:style>
+  <w:style w:type="character" w:styleId="Hyperlink">
+    <w:name w:val="Hyperlink"/>
+    <w:basedOn w:val="DefaultParagraphFont"/>
+    <w:uiPriority w:val="99"/>
+    <w:unhideWhenUsed/>
+    <w:rsid w:val="007E662C"/>
+    <w:rPr>
+      <w:color w:val="467886" w:themeColor="hyperlink"/>
+      <w:u w:val="single"/>
+    </w:rPr>
+  </w:style>
+  <w:style w:type="character" w:styleId="UnresolvedMention">
+    <w:name w:val="Unresolved Mention"/>
+    <w:basedOn w:val="DefaultParagraphFont"/>
+    <w:uiPriority w:val="99"/>
+    <w:semiHidden/>
+    <w:unhideWhenUsed/>
+    <w:rsid w:val="007E662C"/>
+    <w:rPr>
+      <w:color w:val="605E5C"/>
+      <w:shd w:val="clear" w:color="auto" w:fill="E1DFDD"/>
+    </w:rPr>
+  </w:style>
 </w:styles>
 </file>
 

</xml_diff>